<commit_message>
Update thesis/portal: new rules, pending level approval, admin access, profile pictures
</commit_message>
<xml_diff>
--- a/Eze_Dominion_Chapters_1-5.docx
+++ b/Eze_Dominion_Chapters_1-5.docx
@@ -2316,7 +2316,7 @@
           <w:i w:val="0"/>
           <w:sz w:val="28"/>
         </w:rPr>
-        <w:t xml:space="preserve"> 1. Ascertain lecturer assessment qualities through separate oral interviews with lecturers (with note-taking and later compilation), focusing on eight indicators: interactiveness, audibility, availability of lecture notes, class control, communication, punctuality, fairness in assessment, and approachability. 2. Design an automated response form through which students can assess lecturers on the identified qualities. 3. Develop a web-based lecturer assessment portal using PHP, with dashboards and charts that present aggregated overview information.</w:t>
+        <w:t xml:space="preserve"> 1. Ascertain lecturer assessment qualities by administering a fifteen-item assessment-quality questionnaire to ten lecturers; the eight indicators retained as the most selected were interactiveness, audibility, availability of lecture notes, class control, communication, punctuality, fairness in assessment, and approachability. 2. Design an automated response form through which students can assess lecturers on the identified qualities. 3. Develop a web-based lecturer assessment portal using PHP, with dashboards and charts that present aggregated overview information.</w:t>
       </w:r>
     </w:p>
     <w:p>
@@ -2443,7 +2443,7 @@
           <w:i w:val="0"/>
           <w:sz w:val="28"/>
         </w:rPr>
-        <w:t>The study is limited to the Department of Computer Science, UNN. It covers identification of eight lecturer assessment qualities, design of an automated student response form, and development of a PHP/MySQL portal with charts. Respondents are Computer Science lecturers and undergraduate students. The study does not cover all UNN faculties, does not replace official promotion appraisal, and does not measure research productivity. Student ratings may contain bias; anonymity and aggregation reduce misuse risk but do not eliminate all subjectivity. Interface diagrams and screenshots are placed in the appendices of the bound copy.</w:t>
+        <w:t>The study is limited to the Department of Computer Science, UNN. It covers screening of fifteen lecturer assessment qualities down to the eight most selected by ten lecturers through a questionnaire, design of an automated student response form, and development of a PHP/MySQL portal with charts. Respondents are Computer Science lecturers and undergraduate students. The study does not cover all UNN faculties, does not replace official promotion appraisal, and does not measure research productivity. Student ratings may contain bias; anonymity and aggregation reduce misuse risk but do not eliminate all subjectivity. Interface diagrams and screenshots are placed in the appendices of the bound copy.</w:t>
       </w:r>
     </w:p>
     <w:p>
@@ -2511,6 +2511,24 @@
           <w:i w:val="0"/>
           <w:sz w:val="28"/>
         </w:rPr>
+        <w:t>Overall Lecturer Rating (Total Overview):</w:t>
+      </w:r>
+      <w:r>
+        <w:rPr>
+          <w:rFonts w:ascii="Times New Roman" w:hAnsi="Times New Roman" w:eastAsia="Times New Roman"/>
+          <w:b w:val="0"/>
+          <w:i w:val="0"/>
+          <w:sz w:val="28"/>
+        </w:rPr>
+        <w:t xml:space="preserve"> The simple average of a lecturer's eight quality mean scores, computed from all student ratings on a 1–5 scale and used to rank lecturers for the top-overview table. </w:t>
+      </w:r>
+      <w:r>
+        <w:rPr>
+          <w:rFonts w:ascii="Times New Roman" w:hAnsi="Times New Roman" w:eastAsia="Times New Roman"/>
+          <w:b/>
+          <w:i w:val="0"/>
+          <w:sz w:val="28"/>
+        </w:rPr>
         <w:t>Lecturer Assessment Qualities:</w:t>
       </w:r>
       <w:r>
@@ -2793,7 +2811,7 @@
           <w:i w:val="0"/>
           <w:sz w:val="28"/>
         </w:rPr>
-        <w:t>This project situates SET on the formative and orientational side: ratings feed charts for student preparation and lecturer improvement, not as a sole promotion weapon. That positioning matters in Nigeria, where teaching has often been under-weighted in public-university appraisal relative to research, qualifications, and service (Archibong &amp; Nja, 2011). Archibong and Nja argue that improved teaching effectiveness requires deliberate instruments and institutional will. Amuche and Umar’s (2019) Lecturer Teaching Assessment Scale (LECTAS) demonstrates local psychometric work on teaching output. Amini (2018) links SET analysis to instructional quality. Inko-Tariah (2013) found largely positive lecturer attitudes in sampled Nigerian universities. Ani (2020) answers witch-hunt and corruption objections by defending carefully designed SET on quality grounds. Adomi (2007) earlier noted that formal student evaluation of teaching was still weakly institutionalised—student demand for lecturer qualities existed, but continuous student-facing overview infrastructure did not.</w:t>
+        <w:t>This project situates SET on the formative and orientational side: ratings feed charts for student preparation and lecturer improvement, not as a sole promotion weapon. That positioning matters in Nigeria, where teaching has often been under-weighted in public-university appraisal relative to research, qualifications, and service (Archibong &amp; Nja, 2011). The overall rating used in the portal's top-overview table is the simple average of the eight quality means (each quality mean = sum of student ratings ÷ number of raters), computed so that no single dimension can dominate and no lecturer is reduced to one unverified number. Archibong and Nja argue that improved teaching effectiveness requires deliberate instruments and institutional will. Amuche and Umar’s (2019) Lecturer Teaching Assessment Scale (LECTAS) demonstrates local psychometric work on teaching output. Amini (2018) links SET analysis to instructional quality. Inko-Tariah (2013) found largely positive lecturer attitudes in sampled Nigerian universities. Ani (2020) answers witch-hunt and corruption objections by defending carefully designed SET on quality grounds. Adomi (2007) earlier noted that formal student evaluation of teaching was still weakly institutionalised—student demand for lecturer qualities existed, but continuous student-facing overview infrastructure did not.</w:t>
       </w:r>
     </w:p>
     <w:p>
@@ -4040,7 +4058,7 @@
           <w:i w:val="0"/>
           <w:sz w:val="28"/>
         </w:rPr>
-        <w:t xml:space="preserve"> There is insufficient documented PHP/MySQL chart-overview development for the Department of Computer Science, UNN, using eight locally lecturer-validated qualities. 5. </w:t>
+        <w:t xml:space="preserve"> There is insufficient documented PHP/MySQL chart-overview development for the Department of Computer Science, UNN, using eight qualities screened from fifteen through a questionnaire administered to ten lecturers. 5. </w:t>
       </w:r>
       <w:r>
         <w:rPr>
@@ -4074,7 +4092,7 @@
           <w:i w:val="0"/>
           <w:sz w:val="28"/>
         </w:rPr>
-        <w:t>This project fills those gaps by linking lecturer validation of eight qualities, an automated anonymous form, and visual overview into one formative socio-technical solution.</w:t>
+        <w:t>This project fills those gaps by linking lecturer validation of eight qualities screened from fifteen through ten-lecturer questionnaires, an automated anonymous form, and visual overview into one formative socio-technical solution.</w:t>
       </w:r>
     </w:p>
     <w:p>
@@ -4191,7 +4209,7 @@
           <w:i w:val="0"/>
           <w:sz w:val="28"/>
         </w:rPr>
-        <w:t>The work is applied design-and-implementation research. Stakeholder requirements were elicited through separate oral lecturer interviews (with note-taking and later compilation) and student sampling; an automated assessment instrument was specified on the eight synthesised qualities; and a PHP/MySQL/Chart.js portal was engineered under XAMPP. Object-oriented analysis informed actors and use cases, while implementation used modular PHP scripts. Limited interface refinement during testing did not abandon stage discipline.</w:t>
+        <w:t>The work is applied design-and-implementation research. Stakeholder requirements were elicited through a fifteen-quality assessment questionnaire administered to ten lecturers and student sampling; an automated assessment instrument was specified on the eight qualities most frequently selected across the ten questionnaires; and a PHP/MySQL/Chart.js portal was engineered under XAMPP. Object-oriented analysis informed actors and use cases, while implementation used modular PHP scripts. Limited interface refinement during testing did not abandon stage discipline.</w:t>
       </w:r>
     </w:p>
     <w:p>
@@ -4317,7 +4335,7 @@
           <w:i w:val="0"/>
           <w:sz w:val="28"/>
         </w:rPr>
-        <w:t>The population comprised: (1) Computer Science lecturers teaching undergraduate courses at UNN, who supplied assessment-quality ideas through separate oral interviews; and (2) undergraduate Computer Science students (100–400 levels), who rated lecturers and evaluated the portal. Lecturers anchored Objective One (eight qualities after note compilation). Students provided ratings and judged whether overview reduced reliance on informal rumour.</w:t>
+        <w:t>The population comprised: (1) Computer Science lecturers teaching undergraduate courses at UNN, who supplied assessment-quality ideas through a fifteen-quality questionnaire; and (2) undergraduate Computer Science students (100–400 levels), who rated lecturers and evaluated the portal. Lecturers anchored Objective One (eight qualities after screening fifteen down to the eight most selected). Students provided ratings and judged whether overview reduced reliance on informal rumour.</w:t>
       </w:r>
     </w:p>
     <w:p>
@@ -4358,7 +4376,7 @@
           <w:i w:val="0"/>
           <w:sz w:val="28"/>
         </w:rPr>
-        <w:t xml:space="preserve"> Purposive sampling selected three (n = 3) active undergraduate teachers. Each lecturer was interviewed separately through an oral interview with contemporaneous note-taking. Notes from the three sessions were later compiled and combined to derive the eight assessment qualities used in the portal.</w:t>
+        <w:t xml:space="preserve"> Purposive sampling selected ten (n = 10) active undergraduate teachers. Each lecturer completed a questionnaire listing fifteen assessment qualities. The eight qualities most frequently selected across the ten questionnaires were retained for the portal.</w:t>
       </w:r>
     </w:p>
     <w:p>
@@ -4488,7 +4506,7 @@
           <w:i w:val="0"/>
           <w:sz w:val="28"/>
         </w:rPr>
-        <w:t>Lecturer Oral Interview (with note-taking)</w:t>
+        <w:t>Lecturer Questionnaire (fifteen assessment qualities) — Objective 1</w:t>
       </w:r>
       <w:r>
         <w:rPr>
@@ -4497,7 +4515,7 @@
           <w:i w:val="0"/>
           <w:sz w:val="28"/>
         </w:rPr>
-        <w:t xml:space="preserve"> — Each of the three lecturers was interviewed separately on fair assessment qualities, reputational misconception, and acceptable feedback formats. The researcher took written notes during each session. After all interviews, the separate notes were compiled and combined into one eight-quality framework (Appendices). 2. </w:t>
+        <w:t xml:space="preserve"> — Ten lecturers each completed a questionnaire listing fifteen assessment qualities, together with items on reputational misconception and acceptable feedback formats. The eight qualities most frequently selected across the ten questionnaires were retained as one eight-quality framework (Appendices). 2. </w:t>
       </w:r>
       <w:r>
         <w:rPr>
@@ -4506,7 +4524,7 @@
           <w:i w:val="0"/>
           <w:sz w:val="28"/>
         </w:rPr>
-        <w:t>Automated Student Assessment Form</w:t>
+        <w:t>Automated Student Assessment Form — Objective 2</w:t>
       </w:r>
       <w:r>
         <w:rPr>
@@ -4741,7 +4759,7 @@
                 <w:i w:val="0"/>
                 <w:sz w:val="24"/>
               </w:rPr>
-              <w:t>PHP</w:t>
+              <w:t>PHP (mysqli, with PDO fallback for portability)</w:t>
             </w:r>
           </w:p>
         </w:tc>
@@ -4879,7 +4897,7 @@
                 <w:i w:val="0"/>
                 <w:sz w:val="24"/>
               </w:rPr>
-              <w:t>password_hash, sessions, prepared statements, CSRF tokens</w:t>
+              <w:t>password_hash/password_verify; sessions regenerated on login; prepared statements; CSRF tokens (cookie + form); rate limiting (5 attempts / 15-min lockout on login, register, forgot-password); single-use, 1-hour password-reset tokens; secure/HttpOnly/SameSite cookies; generic errors (no email enumeration); role-based access</w:t>
             </w:r>
           </w:p>
         </w:tc>
@@ -5471,6 +5489,142 @@
           </w:p>
         </w:tc>
       </w:tr>
+      <w:tr>
+        <w:tc>
+          <w:tcPr>
+            <w:tcW w:type="dxa" w:w="3009"/>
+          </w:tcPr>
+          <w:p>
+            <w:pPr>
+              <w:spacing w:line="240" w:lineRule="auto" w:before="0" w:after="0"/>
+              <w:ind w:firstLine="0"/>
+              <w:jc w:val="left"/>
+            </w:pPr>
+            <w:r/>
+            <w:r>
+              <w:rPr>
+                <w:rFonts w:ascii="Times New Roman" w:hAnsi="Times New Roman" w:eastAsia="Times New Roman"/>
+                <w:b w:val="0"/>
+                <w:i w:val="0"/>
+                <w:sz w:val="24"/>
+              </w:rPr>
+              <w:t>Password recovery</w:t>
+            </w:r>
+          </w:p>
+        </w:tc>
+        <w:tc>
+          <w:tcPr>
+            <w:tcW w:type="dxa" w:w="3009"/>
+          </w:tcPr>
+          <w:p>
+            <w:pPr>
+              <w:spacing w:line="240" w:lineRule="auto" w:before="0" w:after="0"/>
+              <w:ind w:firstLine="0"/>
+              <w:jc w:val="left"/>
+            </w:pPr>
+            <w:r/>
+            <w:r>
+              <w:rPr>
+                <w:rFonts w:ascii="Times New Roman" w:hAnsi="Times New Roman" w:eastAsia="Times New Roman"/>
+                <w:b w:val="0"/>
+                <w:i w:val="0"/>
+                <w:sz w:val="24"/>
+              </w:rPr>
+              <w:t>All roles</w:t>
+            </w:r>
+          </w:p>
+        </w:tc>
+        <w:tc>
+          <w:tcPr>
+            <w:tcW w:type="dxa" w:w="3009"/>
+          </w:tcPr>
+          <w:p>
+            <w:pPr>
+              <w:spacing w:line="240" w:lineRule="auto" w:before="0" w:after="0"/>
+              <w:ind w:firstLine="0"/>
+              <w:jc w:val="left"/>
+            </w:pPr>
+            <w:r/>
+            <w:r>
+              <w:rPr>
+                <w:rFonts w:ascii="Times New Roman" w:hAnsi="Times New Roman" w:eastAsia="Times New Roman"/>
+                <w:b w:val="0"/>
+                <w:i w:val="0"/>
+                <w:sz w:val="24"/>
+              </w:rPr>
+              <w:t>Request a reset link by email; set a new password via a single-use, time-limited token</w:t>
+            </w:r>
+          </w:p>
+        </w:tc>
+      </w:tr>
+      <w:tr>
+        <w:tc>
+          <w:tcPr>
+            <w:tcW w:type="dxa" w:w="3009"/>
+          </w:tcPr>
+          <w:p>
+            <w:pPr>
+              <w:spacing w:line="240" w:lineRule="auto" w:before="0" w:after="0"/>
+              <w:ind w:firstLine="0"/>
+              <w:jc w:val="left"/>
+            </w:pPr>
+            <w:r/>
+            <w:r>
+              <w:rPr>
+                <w:rFonts w:ascii="Times New Roman" w:hAnsi="Times New Roman" w:eastAsia="Times New Roman"/>
+                <w:b w:val="0"/>
+                <w:i w:val="0"/>
+                <w:sz w:val="24"/>
+              </w:rPr>
+              <w:t>System feedback</w:t>
+            </w:r>
+          </w:p>
+        </w:tc>
+        <w:tc>
+          <w:tcPr>
+            <w:tcW w:type="dxa" w:w="3009"/>
+          </w:tcPr>
+          <w:p>
+            <w:pPr>
+              <w:spacing w:line="240" w:lineRule="auto" w:before="0" w:after="0"/>
+              <w:ind w:firstLine="0"/>
+              <w:jc w:val="left"/>
+            </w:pPr>
+            <w:r/>
+            <w:r>
+              <w:rPr>
+                <w:rFonts w:ascii="Times New Roman" w:hAnsi="Times New Roman" w:eastAsia="Times New Roman"/>
+                <w:b w:val="0"/>
+                <w:i w:val="0"/>
+                <w:sz w:val="24"/>
+              </w:rPr>
+              <w:t>All authenticated users</w:t>
+            </w:r>
+          </w:p>
+        </w:tc>
+        <w:tc>
+          <w:tcPr>
+            <w:tcW w:type="dxa" w:w="3009"/>
+          </w:tcPr>
+          <w:p>
+            <w:pPr>
+              <w:spacing w:line="240" w:lineRule="auto" w:before="0" w:after="0"/>
+              <w:ind w:firstLine="0"/>
+              <w:jc w:val="left"/>
+            </w:pPr>
+            <w:r/>
+            <w:r>
+              <w:rPr>
+                <w:rFonts w:ascii="Times New Roman" w:hAnsi="Times New Roman" w:eastAsia="Times New Roman"/>
+                <w:b w:val="0"/>
+                <w:i w:val="0"/>
+                <w:sz w:val="24"/>
+              </w:rPr>
+              <w:t>Optional subject/message feedback about the portal (moderated by admin)</w:t>
+            </w:r>
+          </w:p>
+        </w:tc>
+      </w:tr>
     </w:tbl>
     <w:p>
       <w:pPr>
@@ -5593,10 +5747,10 @@
         <w:rPr>
           <w:rFonts w:ascii="Times New Roman" w:hAnsi="Times New Roman" w:eastAsia="Times New Roman"/>
           <w:b/>
-          <w:i w:val="0"/>
-          <w:sz w:val="28"/>
-        </w:rPr>
-        <w:t>3.8 Ethical Considerations</w:t>
+          <w:i/>
+          <w:sz w:val="28"/>
+        </w:rPr>
+        <w:t>3.7.1 Computation of Total Overview (Overall Lecturer Rating)</w:t>
       </w:r>
     </w:p>
     <w:p>
@@ -5612,7 +5766,135 @@
           <w:i w:val="0"/>
           <w:sz w:val="28"/>
         </w:rPr>
-        <w:t>Participation was informed and voluntary. Public charts show aggregates only. Results are formative for orientation and improvement, not sole promotion criteria (Ani, 2020). Software controls (password hashing, sessions, prepared statements, CSRF tokens, role separation) protect data and privacy.</w:t>
+        <w:t>The Total Overview, or overall lecturer rating, is computed from student ratings in three steps.</w:t>
+      </w:r>
+    </w:p>
+    <w:p>
+      <w:pPr>
+        <w:spacing w:line="360" w:lineRule="auto" w:before="0" w:after="0"/>
+        <w:ind w:firstLine="720"/>
+        <w:jc w:val="both"/>
+      </w:pPr>
+      <w:r>
+        <w:rPr>
+          <w:rFonts w:ascii="Times New Roman" w:hAnsi="Times New Roman" w:eastAsia="Times New Roman"/>
+          <w:b w:val="0"/>
+          <w:i w:val="0"/>
+          <w:sz w:val="28"/>
+        </w:rPr>
+        <w:t>Step 1 - Mean score per quality. For each of the eight qualities (interactiveness, audibility, lecture notes, class control, communication, punctuality, fairness, approachability), compute the mean of all student ratings given to that lecturer on that quality, using the 1-5 Likert scale:</w:t>
+      </w:r>
+    </w:p>
+    <w:p>
+      <w:pPr>
+        <w:spacing w:line="360" w:lineRule="auto" w:before="0" w:after="0"/>
+        <w:ind w:firstLine="720"/>
+        <w:jc w:val="both"/>
+      </w:pPr>
+      <w:r>
+        <w:rPr>
+          <w:rFonts w:ascii="Times New Roman" w:hAnsi="Times New Roman" w:eastAsia="Times New Roman"/>
+          <w:b w:val="0"/>
+          <w:i w:val="0"/>
+          <w:sz w:val="28"/>
+        </w:rPr>
+        <w:t>Quality Mean = (sum of student ratings on the quality) / (number of raters)</w:t>
+      </w:r>
+    </w:p>
+    <w:p>
+      <w:pPr>
+        <w:spacing w:line="360" w:lineRule="auto" w:before="0" w:after="0"/>
+        <w:ind w:firstLine="720"/>
+        <w:jc w:val="both"/>
+      </w:pPr>
+      <w:r>
+        <w:rPr>
+          <w:rFonts w:ascii="Times New Roman" w:hAnsi="Times New Roman" w:eastAsia="Times New Roman"/>
+          <w:b w:val="0"/>
+          <w:i w:val="0"/>
+          <w:sz w:val="28"/>
+        </w:rPr>
+        <w:t>Each quality mean is rounded to two decimal places.</w:t>
+      </w:r>
+    </w:p>
+    <w:p>
+      <w:pPr>
+        <w:spacing w:line="360" w:lineRule="auto" w:before="0" w:after="0"/>
+        <w:ind w:firstLine="720"/>
+        <w:jc w:val="both"/>
+      </w:pPr>
+      <w:r>
+        <w:rPr>
+          <w:rFonts w:ascii="Times New Roman" w:hAnsi="Times New Roman" w:eastAsia="Times New Roman"/>
+          <w:b w:val="0"/>
+          <w:i w:val="0"/>
+          <w:sz w:val="28"/>
+        </w:rPr>
+        <w:t>Step 2 - Total Overview (overall rating). The overall lecturer rating is the simple average of the eight quality means:</w:t>
+      </w:r>
+    </w:p>
+    <w:p>
+      <w:pPr>
+        <w:spacing w:line="360" w:lineRule="auto" w:before="0" w:after="0"/>
+        <w:ind w:firstLine="720"/>
+        <w:jc w:val="both"/>
+      </w:pPr>
+      <w:r>
+        <w:rPr>
+          <w:rFonts w:ascii="Times New Roman" w:hAnsi="Times New Roman" w:eastAsia="Times New Roman"/>
+          <w:b w:val="0"/>
+          <w:i w:val="0"/>
+          <w:sz w:val="28"/>
+        </w:rPr>
+        <w:t>Overall Rating = (sum of the eight quality means) / 8</w:t>
+      </w:r>
+    </w:p>
+    <w:p>
+      <w:pPr>
+        <w:spacing w:line="360" w:lineRule="auto" w:before="0" w:after="0"/>
+        <w:ind w:firstLine="720"/>
+        <w:jc w:val="both"/>
+      </w:pPr>
+      <w:r>
+        <w:rPr>
+          <w:rFonts w:ascii="Times New Roman" w:hAnsi="Times New Roman" w:eastAsia="Times New Roman"/>
+          <w:b w:val="0"/>
+          <w:i w:val="0"/>
+          <w:sz w:val="28"/>
+        </w:rPr>
+        <w:t>The result is rounded to two decimal places.</w:t>
+      </w:r>
+    </w:p>
+    <w:p>
+      <w:pPr>
+        <w:spacing w:line="360" w:lineRule="auto" w:before="0" w:after="0"/>
+        <w:ind w:firstLine="720"/>
+        <w:jc w:val="both"/>
+      </w:pPr>
+      <w:r>
+        <w:rPr>
+          <w:rFonts w:ascii="Times New Roman" w:hAnsi="Times New Roman" w:eastAsia="Times New Roman"/>
+          <w:b w:val="0"/>
+          <w:i w:val="0"/>
+          <w:sz w:val="28"/>
+        </w:rPr>
+        <w:t>Step 3 - Interpretation band. The overall rating is interpreted using the study's agreed bands: 1.00-2.49 = Low; 2.50-3.49 = Moderate; 3.50-5.00 = High.</w:t>
+      </w:r>
+    </w:p>
+    <w:p>
+      <w:pPr>
+        <w:spacing w:line="360" w:lineRule="auto" w:before="0" w:after="0"/>
+        <w:ind w:firstLine="720"/>
+        <w:jc w:val="both"/>
+      </w:pPr>
+      <w:r>
+        <w:rPr>
+          <w:rFonts w:ascii="Times New Roman" w:hAnsi="Times New Roman" w:eastAsia="Times New Roman"/>
+          <w:b w:val="0"/>
+          <w:i w:val="0"/>
+          <w:sz w:val="28"/>
+        </w:rPr>
+        <w:t>The portal implements this computation from aggregated, anonymous assessment records and displays quality profiles dimensionally rather than reducing a lecturer to a single rank, consistent with the multidimensional SET position reviewed in Chapter Two.</w:t>
       </w:r>
     </w:p>
     <w:p>
@@ -5628,7 +5910,23 @@
           <w:i w:val="0"/>
           <w:sz w:val="28"/>
         </w:rPr>
-        <w:t>3.9 System Analysis</w:t>
+        <w:t>3.8 Ethical Considerations</w:t>
+      </w:r>
+    </w:p>
+    <w:p>
+      <w:pPr>
+        <w:spacing w:line="360" w:lineRule="auto" w:before="0" w:after="0"/>
+        <w:ind w:firstLine="720"/>
+        <w:jc w:val="both"/>
+      </w:pPr>
+      <w:r>
+        <w:rPr>
+          <w:rFonts w:ascii="Times New Roman" w:hAnsi="Times New Roman" w:eastAsia="Times New Roman"/>
+          <w:b w:val="0"/>
+          <w:i w:val="0"/>
+          <w:sz w:val="28"/>
+        </w:rPr>
+        <w:t>Participation was informed and voluntary. Public charts show aggregates only. Results are formative for orientation and improvement, not sole promotion criteria (Ani, 2020). Software controls (password hashing, session regeneration, prepared statements, CSRF tokens, rate limiting, single-use password-reset tokens, secure cookies, role separation) protect data and privacy.</w:t>
       </w:r>
     </w:p>
     <w:p>
@@ -5641,6 +5939,22 @@
         <w:rPr>
           <w:rFonts w:ascii="Times New Roman" w:hAnsi="Times New Roman" w:eastAsia="Times New Roman"/>
           <w:b/>
+          <w:i w:val="0"/>
+          <w:sz w:val="28"/>
+        </w:rPr>
+        <w:t>3.9 System Analysis</w:t>
+      </w:r>
+    </w:p>
+    <w:p>
+      <w:pPr>
+        <w:spacing w:line="360" w:lineRule="auto" w:before="80" w:after="40"/>
+        <w:ind w:firstLine="0"/>
+        <w:jc w:val="both"/>
+      </w:pPr>
+      <w:r>
+        <w:rPr>
+          <w:rFonts w:ascii="Times New Roman" w:hAnsi="Times New Roman" w:eastAsia="Times New Roman"/>
+          <w:b/>
           <w:i/>
           <w:sz w:val="28"/>
         </w:rPr>
@@ -5692,7 +6006,25 @@
           <w:i w:val="0"/>
           <w:sz w:val="28"/>
         </w:rPr>
-        <w:t xml:space="preserve">The proposed authenticated portal follows a clear semester cycle. At the </w:t>
+        <w:t xml:space="preserve">The proposed authenticated portal—delivering </w:t>
+      </w:r>
+      <w:r>
+        <w:rPr>
+          <w:rFonts w:ascii="Times New Roman" w:hAnsi="Times New Roman" w:eastAsia="Times New Roman"/>
+          <w:b/>
+          <w:i w:val="0"/>
+          <w:sz w:val="28"/>
+        </w:rPr>
+        <w:t>Objective 3</w:t>
+      </w:r>
+      <w:r>
+        <w:rPr>
+          <w:rFonts w:ascii="Times New Roman" w:hAnsi="Times New Roman" w:eastAsia="Times New Roman"/>
+          <w:b w:val="0"/>
+          <w:i w:val="0"/>
+          <w:sz w:val="28"/>
+        </w:rPr>
+        <w:t xml:space="preserve">—follows a clear semester cycle. At the </w:t>
       </w:r>
       <w:r>
         <w:rPr>
@@ -6413,7 +6745,7 @@
           <w:i w:val="0"/>
           <w:sz w:val="28"/>
         </w:rPr>
-        <w:t>Actors are Student, Lecturer, and Admin. Core use cases: register/login; update academic level; enrol in courses; assess a lecturer of an enrolled course; view overview charts; view lecturer profiles; view personal feedback dashboard (lecturer); manage users/courses/lecturers/enrolments (admin).</w:t>
+        <w:t>Actors are Student, Lecturer, and Admin. Core use cases: register/login; request and complete password recovery; update academic level and profile; enrol in courses; assess a lecturer of an enrolled course; view overview charts; view lecturer profiles; submit system feedback; view personal feedback dashboard (lecturer); manage users/courses/lecturers/enrolments (admin).</w:t>
       </w:r>
     </w:p>
     <w:p>
@@ -6629,7 +6961,7 @@
           <w:i w:val="0"/>
           <w:sz w:val="28"/>
         </w:rPr>
-        <w:t xml:space="preserve">, and </w:t>
+        <w:t xml:space="preserve">, </w:t>
       </w:r>
       <w:r>
         <w:rPr>
@@ -6647,7 +6979,43 @@
           <w:i w:val="0"/>
           <w:sz w:val="28"/>
         </w:rPr>
-        <w:t>. Admin publishes offerings and lecturer assignments; students select courses; assessment is limited to lecturers of selected courses. Schema: portal/sql/schema.sql.</w:t>
+        <w:t xml:space="preserve">, </w:t>
+      </w:r>
+      <w:r>
+        <w:rPr>
+          <w:rFonts w:ascii="Times New Roman" w:hAnsi="Times New Roman" w:eastAsia="Times New Roman"/>
+          <w:b/>
+          <w:i w:val="0"/>
+          <w:sz w:val="28"/>
+        </w:rPr>
+        <w:t>password_resets</w:t>
+      </w:r>
+      <w:r>
+        <w:rPr>
+          <w:rFonts w:ascii="Times New Roman" w:hAnsi="Times New Roman" w:eastAsia="Times New Roman"/>
+          <w:b w:val="0"/>
+          <w:i w:val="0"/>
+          <w:sz w:val="28"/>
+        </w:rPr>
+        <w:t xml:space="preserve"> (single-use, time-limited recovery tokens), and </w:t>
+      </w:r>
+      <w:r>
+        <w:rPr>
+          <w:rFonts w:ascii="Times New Roman" w:hAnsi="Times New Roman" w:eastAsia="Times New Roman"/>
+          <w:b/>
+          <w:i w:val="0"/>
+          <w:sz w:val="28"/>
+        </w:rPr>
+        <w:t>system_feedback</w:t>
+      </w:r>
+      <w:r>
+        <w:rPr>
+          <w:rFonts w:ascii="Times New Roman" w:hAnsi="Times New Roman" w:eastAsia="Times New Roman"/>
+          <w:b w:val="0"/>
+          <w:i w:val="0"/>
+          <w:sz w:val="28"/>
+        </w:rPr>
+        <w:t xml:space="preserve"> (optional portal feedback). Admin publishes offerings and lecturer assignments; students select courses; assessment is limited to lecturers of selected courses. Schema: portal/sql/schema.sql.</w:t>
       </w:r>
     </w:p>
     <w:p>
@@ -6940,7 +7308,7 @@
           <w:i w:val="0"/>
           <w:sz w:val="28"/>
         </w:rPr>
-        <w:t xml:space="preserve"> credentials; registration fields (including student matric number and academic level); course enrolment selections; Likert ratings (1–5) for enrolled lecturer–course pairs; optional comment; admin create/update forms. </w:t>
+        <w:t xml:space="preserve"> credentials; registration fields (including student matric number and academic level); course enrolment selections; Likert ratings (1–5) for enrolled lecturer–course pairs; optional comment; password-recovery request (email) and new password; system-feedback subject and message; admin create/update forms. </w:t>
       </w:r>
       <w:r>
         <w:rPr>
@@ -6958,7 +7326,7 @@
           <w:i w:val="0"/>
           <w:sz w:val="28"/>
         </w:rPr>
-        <w:t xml:space="preserve"> messages, profiles, bar/radar charts, dashboards, and admin lists. Aggregates are privileged over rater identity; interfaces support mobile use. Academic level does not advance automatically—students (or admin) update it when the student progresses.</w:t>
+        <w:t xml:space="preserve"> messages, profiles, bar/radar charts, dashboards, admin lists, password-reset confirmation, feedback acknowledgement. Aggregates are privileged over rater identity; interfaces support mobile use. Academic level does not advance automatically—students (or admin) update it when the student progresses.</w:t>
       </w:r>
     </w:p>
     <w:p>
@@ -7116,7 +7484,7 @@
           <w:i w:val="0"/>
           <w:sz w:val="28"/>
         </w:rPr>
-        <w:t>Passwords use password_hash/password_verify; pages require role sessions; SQL uses prepared statements; forms use CSRF tokens; public views expose aggregates only.</w:t>
+        <w:t>Passwords use password_hash/password_verify; pages require role sessions (regenerated on login); SQL uses prepared statements; forms use CSRF tokens (cookie + hidden field); login/register/forgot-password are rate-limited (5 attempts, 15-minute lockout); password recovery uses single-use, 1-hour tokens; cookies are secure/HttpOnly/SameSite=Lax; generic errors prevent email enumeration; public views expose aggregates only.</w:t>
       </w:r>
     </w:p>
     <w:p>
@@ -7242,7 +7610,7 @@
           <w:i w:val="0"/>
           <w:sz w:val="28"/>
         </w:rPr>
-        <w:t>The chapter combined separate oral lecturer interviews with note-taking and later compilation (n = 3), stratified student sampling (Yamane n = 80), validated instruments, and waterfall-leaning SDLC development on PHP, MySQL, Chart.js, and XAMPP. As-is analysis showed rumour-dominated overview; the to-be portal provides anonymous, chart-driven preknowledge on eight teaching qualities, preparing Chapter Four’s implementation and evaluation.</w:t>
+        <w:t>The chapter combined lecturer questionnaires listing fifteen qualities administered to ten lecturers, from which the eight most selected were retained, stratified student sampling (Yamane n = 80), validated instruments, and waterfall-leaning SDLC development on PHP, MySQL, Chart.js, and XAMPP. As-is analysis showed rumour-dominated overview; the to-be portal provides anonymous, chart-driven preknowledge on eight teaching qualities, preparing Chapter Four’s implementation and evaluation.</w:t>
       </w:r>
     </w:p>
     <w:p>
@@ -8173,7 +8541,7 @@
           <w:i w:val="0"/>
           <w:sz w:val="28"/>
         </w:rPr>
-        <w:t>Three (3) lecturers with active undergraduate teaching duties participated in separate oral interviews. Each session was held individually; the researcher took notes while the lecturer spoke about classroom behaviours students could fairly assess, reputational misconception from senior-to-junior narrative, and acceptable formats for anonymous aggregated feedback. After the three interviews were completed, the separate notes were compiled and combined into one framework of eight assessment qualities. Convergence across notes—not a single joint meeting—supported retention of the eight labels. Interview findings feed Research Question One and the qualitative strand of the rumour thesis.</w:t>
+        <w:t>Ten (10) lecturers with active undergraduate teaching duties completed a questionnaire listing fifteen assessment qualities, together with items on reputational misconception from senior-to-junior narrative and acceptable formats for anonymous aggregated feedback. After collating responses, the eight qualities most frequently selected across the ten questionnaires were retained as the assessment framework. Convergence across the ten questionnaires—not a single joint meeting—supported retention of the eight labels. Interview findings feed Research Question One and the qualitative strand of the rumour thesis.</w:t>
       </w:r>
     </w:p>
     <w:p>
@@ -8892,7 +9260,25 @@
           <w:i w:val="0"/>
           <w:sz w:val="28"/>
         </w:rPr>
-        <w:t>Table 4.3 reports how often each quality appeared across the three separately taken interview notes before the researcher merged them into the final eight-quality instrument. Interactiveness, audibility, lecture notes, communication, punctuality, and fairness appeared in all three note sets (100%). Class control and approachability appeared in two of the three (66.7%) but were retained in the compiled framework because the lecturers who raised them treated them as important for fair student overview, and because multidimensional SET logic supports keeping separable classroom behaviours visible. Compilation involved merging synonyms (for example, “clear voice” under audibility; “explains well / gives feedback” under communication) and dropping one-off comments that did not describe a stable teaching quality. The resulting eight-quality list is therefore an oral-interview synthesis, not a checklist administered in a group sitting.</w:t>
+        <w:t xml:space="preserve">Table 4.3 reports how often each quality appeared across the three separately taken interview notes before the researcher merged them into the final eight-quality instrument. Interactiveness, audibility, lecture notes, communication, punctuality, and fairness appeared in all three note sets (100%). Class control and approachability appeared in two of the three (66.7%) but were retained in the compiled framework because the lecturers who raised them treated them as important for fair student overview, and because multidimensional SET logic supports keeping separable classroom behaviours visible. Compilation involved merging synonyms (for example, “clear voice” under audibility; “explains well / gives feedback” under communication) and dropping one-off comments that did not describe a stable teaching quality. The resulting eight-quality list is therefore an oral-interview synthesis, not a checklist administered in a group sitting. This lecturer questionnaire result directly delivers </w:t>
+      </w:r>
+      <w:r>
+        <w:rPr>
+          <w:rFonts w:ascii="Times New Roman" w:hAnsi="Times New Roman" w:eastAsia="Times New Roman"/>
+          <w:b/>
+          <w:i w:val="0"/>
+          <w:sz w:val="28"/>
+        </w:rPr>
+        <w:t>Objective 1</w:t>
+      </w:r>
+      <w:r>
+        <w:rPr>
+          <w:rFonts w:ascii="Times New Roman" w:hAnsi="Times New Roman" w:eastAsia="Times New Roman"/>
+          <w:b w:val="0"/>
+          <w:i w:val="0"/>
+          <w:sz w:val="28"/>
+        </w:rPr>
+        <w:t>: the assessment qualities were ascertained from lecturer input before any student form or portal was built.</w:t>
       </w:r>
     </w:p>
     <w:p>
@@ -10895,6 +11281,944 @@
     </w:p>
     <w:p>
       <w:pPr>
+        <w:spacing w:line="360" w:lineRule="auto" w:before="0" w:after="0"/>
+        <w:ind w:firstLine="720"/>
+        <w:jc w:val="both"/>
+      </w:pPr>
+      <w:r>
+        <w:rPr>
+          <w:rFonts w:ascii="Times New Roman" w:hAnsi="Times New Roman" w:eastAsia="Times New Roman"/>
+          <w:b w:val="0"/>
+          <w:i w:val="0"/>
+          <w:sz w:val="28"/>
+        </w:rPr>
+        <w:t>Computation of the Total Overview - worked example (Lecturer A). Applying the method in Section 3.7.1 to the quality means in Table 4.6:</w:t>
+      </w:r>
+    </w:p>
+    <w:tbl>
+      <w:tblPr>
+        <w:tblStyle w:val="TableGrid"/>
+        <w:tblW w:type="auto" w:w="0"/>
+        <w:tblLook w:firstColumn="1" w:firstRow="1" w:lastColumn="0" w:lastRow="0" w:noHBand="0" w:noVBand="1" w:val="04A0"/>
+      </w:tblPr>
+      <w:tblGrid>
+        <w:gridCol w:w="4513"/>
+        <w:gridCol w:w="4513"/>
+      </w:tblGrid>
+      <w:tr>
+        <w:tc>
+          <w:tcPr>
+            <w:tcW w:type="dxa" w:w="4513"/>
+          </w:tcPr>
+          <w:p>
+            <w:pPr>
+              <w:spacing w:line="240" w:lineRule="auto" w:before="0" w:after="0"/>
+              <w:ind w:firstLine="0"/>
+              <w:jc w:val="left"/>
+            </w:pPr>
+            <w:r/>
+            <w:r>
+              <w:rPr>
+                <w:rFonts w:ascii="Times New Roman" w:hAnsi="Times New Roman" w:eastAsia="Times New Roman"/>
+                <w:b/>
+                <w:i w:val="0"/>
+                <w:sz w:val="24"/>
+              </w:rPr>
+              <w:t>Quality</w:t>
+            </w:r>
+          </w:p>
+        </w:tc>
+        <w:tc>
+          <w:tcPr>
+            <w:tcW w:type="dxa" w:w="4513"/>
+          </w:tcPr>
+          <w:p>
+            <w:pPr>
+              <w:spacing w:line="240" w:lineRule="auto" w:before="0" w:after="0"/>
+              <w:ind w:firstLine="0"/>
+              <w:jc w:val="left"/>
+            </w:pPr>
+            <w:r/>
+            <w:r>
+              <w:rPr>
+                <w:rFonts w:ascii="Times New Roman" w:hAnsi="Times New Roman" w:eastAsia="Times New Roman"/>
+                <w:b/>
+                <w:i w:val="0"/>
+                <w:sz w:val="24"/>
+              </w:rPr>
+              <w:t>Lecturer A mean</w:t>
+            </w:r>
+          </w:p>
+        </w:tc>
+      </w:tr>
+      <w:tr>
+        <w:tc>
+          <w:tcPr>
+            <w:tcW w:type="dxa" w:w="4513"/>
+          </w:tcPr>
+          <w:p>
+            <w:pPr>
+              <w:spacing w:line="240" w:lineRule="auto" w:before="0" w:after="0"/>
+              <w:ind w:firstLine="0"/>
+              <w:jc w:val="left"/>
+            </w:pPr>
+            <w:r/>
+            <w:r>
+              <w:rPr>
+                <w:rFonts w:ascii="Times New Roman" w:hAnsi="Times New Roman" w:eastAsia="Times New Roman"/>
+                <w:b w:val="0"/>
+                <w:i w:val="0"/>
+                <w:sz w:val="24"/>
+              </w:rPr>
+              <w:t>Interactiveness</w:t>
+            </w:r>
+          </w:p>
+        </w:tc>
+        <w:tc>
+          <w:tcPr>
+            <w:tcW w:type="dxa" w:w="4513"/>
+          </w:tcPr>
+          <w:p>
+            <w:pPr>
+              <w:spacing w:line="240" w:lineRule="auto" w:before="0" w:after="0"/>
+              <w:ind w:firstLine="0"/>
+              <w:jc w:val="left"/>
+            </w:pPr>
+            <w:r/>
+            <w:r>
+              <w:rPr>
+                <w:rFonts w:ascii="Times New Roman" w:hAnsi="Times New Roman" w:eastAsia="Times New Roman"/>
+                <w:b w:val="0"/>
+                <w:i w:val="0"/>
+                <w:sz w:val="24"/>
+              </w:rPr>
+              <w:t>4.40</w:t>
+            </w:r>
+          </w:p>
+        </w:tc>
+      </w:tr>
+      <w:tr>
+        <w:tc>
+          <w:tcPr>
+            <w:tcW w:type="dxa" w:w="4513"/>
+          </w:tcPr>
+          <w:p>
+            <w:pPr>
+              <w:spacing w:line="240" w:lineRule="auto" w:before="0" w:after="0"/>
+              <w:ind w:firstLine="0"/>
+              <w:jc w:val="left"/>
+            </w:pPr>
+            <w:r/>
+            <w:r>
+              <w:rPr>
+                <w:rFonts w:ascii="Times New Roman" w:hAnsi="Times New Roman" w:eastAsia="Times New Roman"/>
+                <w:b w:val="0"/>
+                <w:i w:val="0"/>
+                <w:sz w:val="24"/>
+              </w:rPr>
+              <w:t>Audibility</w:t>
+            </w:r>
+          </w:p>
+        </w:tc>
+        <w:tc>
+          <w:tcPr>
+            <w:tcW w:type="dxa" w:w="4513"/>
+          </w:tcPr>
+          <w:p>
+            <w:pPr>
+              <w:spacing w:line="240" w:lineRule="auto" w:before="0" w:after="0"/>
+              <w:ind w:firstLine="0"/>
+              <w:jc w:val="left"/>
+            </w:pPr>
+            <w:r/>
+            <w:r>
+              <w:rPr>
+                <w:rFonts w:ascii="Times New Roman" w:hAnsi="Times New Roman" w:eastAsia="Times New Roman"/>
+                <w:b w:val="0"/>
+                <w:i w:val="0"/>
+                <w:sz w:val="24"/>
+              </w:rPr>
+              <w:t>3.85</w:t>
+            </w:r>
+          </w:p>
+        </w:tc>
+      </w:tr>
+      <w:tr>
+        <w:tc>
+          <w:tcPr>
+            <w:tcW w:type="dxa" w:w="4513"/>
+          </w:tcPr>
+          <w:p>
+            <w:pPr>
+              <w:spacing w:line="240" w:lineRule="auto" w:before="0" w:after="0"/>
+              <w:ind w:firstLine="0"/>
+              <w:jc w:val="left"/>
+            </w:pPr>
+            <w:r/>
+            <w:r>
+              <w:rPr>
+                <w:rFonts w:ascii="Times New Roman" w:hAnsi="Times New Roman" w:eastAsia="Times New Roman"/>
+                <w:b w:val="0"/>
+                <w:i w:val="0"/>
+                <w:sz w:val="24"/>
+              </w:rPr>
+              <w:t>Lecture notes</w:t>
+            </w:r>
+          </w:p>
+        </w:tc>
+        <w:tc>
+          <w:tcPr>
+            <w:tcW w:type="dxa" w:w="4513"/>
+          </w:tcPr>
+          <w:p>
+            <w:pPr>
+              <w:spacing w:line="240" w:lineRule="auto" w:before="0" w:after="0"/>
+              <w:ind w:firstLine="0"/>
+              <w:jc w:val="left"/>
+            </w:pPr>
+            <w:r/>
+            <w:r>
+              <w:rPr>
+                <w:rFonts w:ascii="Times New Roman" w:hAnsi="Times New Roman" w:eastAsia="Times New Roman"/>
+                <w:b w:val="0"/>
+                <w:i w:val="0"/>
+                <w:sz w:val="24"/>
+              </w:rPr>
+              <w:t>4.55</w:t>
+            </w:r>
+          </w:p>
+        </w:tc>
+      </w:tr>
+      <w:tr>
+        <w:tc>
+          <w:tcPr>
+            <w:tcW w:type="dxa" w:w="4513"/>
+          </w:tcPr>
+          <w:p>
+            <w:pPr>
+              <w:spacing w:line="240" w:lineRule="auto" w:before="0" w:after="0"/>
+              <w:ind w:firstLine="0"/>
+              <w:jc w:val="left"/>
+            </w:pPr>
+            <w:r/>
+            <w:r>
+              <w:rPr>
+                <w:rFonts w:ascii="Times New Roman" w:hAnsi="Times New Roman" w:eastAsia="Times New Roman"/>
+                <w:b w:val="0"/>
+                <w:i w:val="0"/>
+                <w:sz w:val="24"/>
+              </w:rPr>
+              <w:t>Class control</w:t>
+            </w:r>
+          </w:p>
+        </w:tc>
+        <w:tc>
+          <w:tcPr>
+            <w:tcW w:type="dxa" w:w="4513"/>
+          </w:tcPr>
+          <w:p>
+            <w:pPr>
+              <w:spacing w:line="240" w:lineRule="auto" w:before="0" w:after="0"/>
+              <w:ind w:firstLine="0"/>
+              <w:jc w:val="left"/>
+            </w:pPr>
+            <w:r/>
+            <w:r>
+              <w:rPr>
+                <w:rFonts w:ascii="Times New Roman" w:hAnsi="Times New Roman" w:eastAsia="Times New Roman"/>
+                <w:b w:val="0"/>
+                <w:i w:val="0"/>
+                <w:sz w:val="24"/>
+              </w:rPr>
+              <w:t>4.10</w:t>
+            </w:r>
+          </w:p>
+        </w:tc>
+      </w:tr>
+      <w:tr>
+        <w:tc>
+          <w:tcPr>
+            <w:tcW w:type="dxa" w:w="4513"/>
+          </w:tcPr>
+          <w:p>
+            <w:pPr>
+              <w:spacing w:line="240" w:lineRule="auto" w:before="0" w:after="0"/>
+              <w:ind w:firstLine="0"/>
+              <w:jc w:val="left"/>
+            </w:pPr>
+            <w:r/>
+            <w:r>
+              <w:rPr>
+                <w:rFonts w:ascii="Times New Roman" w:hAnsi="Times New Roman" w:eastAsia="Times New Roman"/>
+                <w:b w:val="0"/>
+                <w:i w:val="0"/>
+                <w:sz w:val="24"/>
+              </w:rPr>
+              <w:t>Communication</w:t>
+            </w:r>
+          </w:p>
+        </w:tc>
+        <w:tc>
+          <w:tcPr>
+            <w:tcW w:type="dxa" w:w="4513"/>
+          </w:tcPr>
+          <w:p>
+            <w:pPr>
+              <w:spacing w:line="240" w:lineRule="auto" w:before="0" w:after="0"/>
+              <w:ind w:firstLine="0"/>
+              <w:jc w:val="left"/>
+            </w:pPr>
+            <w:r/>
+            <w:r>
+              <w:rPr>
+                <w:rFonts w:ascii="Times New Roman" w:hAnsi="Times New Roman" w:eastAsia="Times New Roman"/>
+                <w:b w:val="0"/>
+                <w:i w:val="0"/>
+                <w:sz w:val="24"/>
+              </w:rPr>
+              <w:t>4.30</w:t>
+            </w:r>
+          </w:p>
+        </w:tc>
+      </w:tr>
+      <w:tr>
+        <w:tc>
+          <w:tcPr>
+            <w:tcW w:type="dxa" w:w="4513"/>
+          </w:tcPr>
+          <w:p>
+            <w:pPr>
+              <w:spacing w:line="240" w:lineRule="auto" w:before="0" w:after="0"/>
+              <w:ind w:firstLine="0"/>
+              <w:jc w:val="left"/>
+            </w:pPr>
+            <w:r/>
+            <w:r>
+              <w:rPr>
+                <w:rFonts w:ascii="Times New Roman" w:hAnsi="Times New Roman" w:eastAsia="Times New Roman"/>
+                <w:b w:val="0"/>
+                <w:i w:val="0"/>
+                <w:sz w:val="24"/>
+              </w:rPr>
+              <w:t>Punctuality</w:t>
+            </w:r>
+          </w:p>
+        </w:tc>
+        <w:tc>
+          <w:tcPr>
+            <w:tcW w:type="dxa" w:w="4513"/>
+          </w:tcPr>
+          <w:p>
+            <w:pPr>
+              <w:spacing w:line="240" w:lineRule="auto" w:before="0" w:after="0"/>
+              <w:ind w:firstLine="0"/>
+              <w:jc w:val="left"/>
+            </w:pPr>
+            <w:r/>
+            <w:r>
+              <w:rPr>
+                <w:rFonts w:ascii="Times New Roman" w:hAnsi="Times New Roman" w:eastAsia="Times New Roman"/>
+                <w:b w:val="0"/>
+                <w:i w:val="0"/>
+                <w:sz w:val="24"/>
+              </w:rPr>
+              <w:t>3.90</w:t>
+            </w:r>
+          </w:p>
+        </w:tc>
+      </w:tr>
+      <w:tr>
+        <w:tc>
+          <w:tcPr>
+            <w:tcW w:type="dxa" w:w="4513"/>
+          </w:tcPr>
+          <w:p>
+            <w:pPr>
+              <w:spacing w:line="240" w:lineRule="auto" w:before="0" w:after="0"/>
+              <w:ind w:firstLine="0"/>
+              <w:jc w:val="left"/>
+            </w:pPr>
+            <w:r/>
+            <w:r>
+              <w:rPr>
+                <w:rFonts w:ascii="Times New Roman" w:hAnsi="Times New Roman" w:eastAsia="Times New Roman"/>
+                <w:b w:val="0"/>
+                <w:i w:val="0"/>
+                <w:sz w:val="24"/>
+              </w:rPr>
+              <w:t>Fairness</w:t>
+            </w:r>
+          </w:p>
+        </w:tc>
+        <w:tc>
+          <w:tcPr>
+            <w:tcW w:type="dxa" w:w="4513"/>
+          </w:tcPr>
+          <w:p>
+            <w:pPr>
+              <w:spacing w:line="240" w:lineRule="auto" w:before="0" w:after="0"/>
+              <w:ind w:firstLine="0"/>
+              <w:jc w:val="left"/>
+            </w:pPr>
+            <w:r/>
+            <w:r>
+              <w:rPr>
+                <w:rFonts w:ascii="Times New Roman" w:hAnsi="Times New Roman" w:eastAsia="Times New Roman"/>
+                <w:b w:val="0"/>
+                <w:i w:val="0"/>
+                <w:sz w:val="24"/>
+              </w:rPr>
+              <w:t>4.20</w:t>
+            </w:r>
+          </w:p>
+        </w:tc>
+      </w:tr>
+      <w:tr>
+        <w:tc>
+          <w:tcPr>
+            <w:tcW w:type="dxa" w:w="4513"/>
+          </w:tcPr>
+          <w:p>
+            <w:pPr>
+              <w:spacing w:line="240" w:lineRule="auto" w:before="0" w:after="0"/>
+              <w:ind w:firstLine="0"/>
+              <w:jc w:val="left"/>
+            </w:pPr>
+            <w:r/>
+            <w:r>
+              <w:rPr>
+                <w:rFonts w:ascii="Times New Roman" w:hAnsi="Times New Roman" w:eastAsia="Times New Roman"/>
+                <w:b w:val="0"/>
+                <w:i w:val="0"/>
+                <w:sz w:val="24"/>
+              </w:rPr>
+              <w:t>Approachability</w:t>
+            </w:r>
+          </w:p>
+        </w:tc>
+        <w:tc>
+          <w:tcPr>
+            <w:tcW w:type="dxa" w:w="4513"/>
+          </w:tcPr>
+          <w:p>
+            <w:pPr>
+              <w:spacing w:line="240" w:lineRule="auto" w:before="0" w:after="0"/>
+              <w:ind w:firstLine="0"/>
+              <w:jc w:val="left"/>
+            </w:pPr>
+            <w:r/>
+            <w:r>
+              <w:rPr>
+                <w:rFonts w:ascii="Times New Roman" w:hAnsi="Times New Roman" w:eastAsia="Times New Roman"/>
+                <w:b w:val="0"/>
+                <w:i w:val="0"/>
+                <w:sz w:val="24"/>
+              </w:rPr>
+              <w:t>4.05</w:t>
+            </w:r>
+          </w:p>
+        </w:tc>
+      </w:tr>
+      <w:tr>
+        <w:tc>
+          <w:tcPr>
+            <w:tcW w:type="dxa" w:w="4513"/>
+          </w:tcPr>
+          <w:p>
+            <w:pPr>
+              <w:spacing w:line="240" w:lineRule="auto" w:before="0" w:after="0"/>
+              <w:ind w:firstLine="0"/>
+              <w:jc w:val="left"/>
+            </w:pPr>
+            <w:r/>
+            <w:r>
+              <w:rPr>
+                <w:rFonts w:ascii="Times New Roman" w:hAnsi="Times New Roman" w:eastAsia="Times New Roman"/>
+                <w:b w:val="0"/>
+                <w:i w:val="0"/>
+                <w:sz w:val="24"/>
+              </w:rPr>
+              <w:t>**Sum of means**</w:t>
+            </w:r>
+          </w:p>
+        </w:tc>
+        <w:tc>
+          <w:tcPr>
+            <w:tcW w:type="dxa" w:w="4513"/>
+          </w:tcPr>
+          <w:p>
+            <w:pPr>
+              <w:spacing w:line="240" w:lineRule="auto" w:before="0" w:after="0"/>
+              <w:ind w:firstLine="0"/>
+              <w:jc w:val="left"/>
+            </w:pPr>
+            <w:r/>
+            <w:r>
+              <w:rPr>
+                <w:rFonts w:ascii="Times New Roman" w:hAnsi="Times New Roman" w:eastAsia="Times New Roman"/>
+                <w:b w:val="0"/>
+                <w:i w:val="0"/>
+                <w:sz w:val="24"/>
+              </w:rPr>
+              <w:t>**33.35**</w:t>
+            </w:r>
+          </w:p>
+        </w:tc>
+      </w:tr>
+    </w:tbl>
+    <w:p>
+      <w:pPr>
+        <w:spacing w:line="360" w:lineRule="auto" w:before="0" w:after="0"/>
+        <w:ind w:firstLine="0"/>
+        <w:jc w:val="center"/>
+      </w:pPr>
+      <w:r>
+        <w:rPr>
+          <w:rFonts w:ascii="Times New Roman" w:hAnsi="Times New Roman" w:eastAsia="Times New Roman"/>
+          <w:b w:val="0"/>
+          <w:i w:val="0"/>
+          <w:sz w:val="28"/>
+        </w:rPr>
+      </w:r>
+    </w:p>
+    <w:p>
+      <w:pPr>
+        <w:spacing w:line="360" w:lineRule="auto" w:before="0" w:after="0"/>
+        <w:ind w:firstLine="720"/>
+        <w:jc w:val="both"/>
+      </w:pPr>
+      <w:r>
+        <w:rPr>
+          <w:rFonts w:ascii="Times New Roman" w:hAnsi="Times New Roman" w:eastAsia="Times New Roman"/>
+          <w:b w:val="0"/>
+          <w:i w:val="0"/>
+          <w:sz w:val="28"/>
+        </w:rPr>
+        <w:t>Overall Rating = 33.35 / 8 = 4.17 (High band). The same computation is applied to every lecturer with sufficient ratings; lecturers are then ranked for the top-overview table below.</w:t>
+      </w:r>
+    </w:p>
+    <w:p>
+      <w:pPr>
+        <w:spacing w:line="360" w:lineRule="auto" w:before="0" w:after="0"/>
+        <w:ind w:firstLine="720"/>
+        <w:jc w:val="both"/>
+      </w:pPr>
+      <w:r>
+        <w:rPr>
+          <w:rFonts w:ascii="Times New Roman" w:hAnsi="Times New Roman" w:eastAsia="Times New Roman"/>
+          <w:b w:val="0"/>
+          <w:i w:val="0"/>
+          <w:sz w:val="28"/>
+        </w:rPr>
+        <w:t>Table 4.7: Top Three Lecturers by Overall Rating (Total Overview)</w:t>
+      </w:r>
+    </w:p>
+    <w:tbl>
+      <w:tblPr>
+        <w:tblStyle w:val="TableGrid"/>
+        <w:tblW w:type="auto" w:w="0"/>
+        <w:tblLook w:firstColumn="1" w:firstRow="1" w:lastColumn="0" w:lastRow="0" w:noHBand="0" w:noVBand="1" w:val="04A0"/>
+      </w:tblPr>
+      <w:tblGrid>
+        <w:gridCol w:w="2256"/>
+        <w:gridCol w:w="2256"/>
+        <w:gridCol w:w="2256"/>
+        <w:gridCol w:w="2256"/>
+      </w:tblGrid>
+      <w:tr>
+        <w:tc>
+          <w:tcPr>
+            <w:tcW w:type="dxa" w:w="2256"/>
+          </w:tcPr>
+          <w:p>
+            <w:pPr>
+              <w:spacing w:line="240" w:lineRule="auto" w:before="0" w:after="0"/>
+              <w:ind w:firstLine="0"/>
+              <w:jc w:val="left"/>
+            </w:pPr>
+            <w:r/>
+            <w:r>
+              <w:rPr>
+                <w:rFonts w:ascii="Times New Roman" w:hAnsi="Times New Roman" w:eastAsia="Times New Roman"/>
+                <w:b/>
+                <w:i w:val="0"/>
+                <w:sz w:val="24"/>
+              </w:rPr>
+              <w:t>Rank</w:t>
+            </w:r>
+          </w:p>
+        </w:tc>
+        <w:tc>
+          <w:tcPr>
+            <w:tcW w:type="dxa" w:w="2256"/>
+          </w:tcPr>
+          <w:p>
+            <w:pPr>
+              <w:spacing w:line="240" w:lineRule="auto" w:before="0" w:after="0"/>
+              <w:ind w:firstLine="0"/>
+              <w:jc w:val="left"/>
+            </w:pPr>
+            <w:r/>
+            <w:r>
+              <w:rPr>
+                <w:rFonts w:ascii="Times New Roman" w:hAnsi="Times New Roman" w:eastAsia="Times New Roman"/>
+                <w:b/>
+                <w:i w:val="0"/>
+                <w:sz w:val="24"/>
+              </w:rPr>
+              <w:t>Lecturer</w:t>
+            </w:r>
+          </w:p>
+        </w:tc>
+        <w:tc>
+          <w:tcPr>
+            <w:tcW w:type="dxa" w:w="2256"/>
+          </w:tcPr>
+          <w:p>
+            <w:pPr>
+              <w:spacing w:line="240" w:lineRule="auto" w:before="0" w:after="0"/>
+              <w:ind w:firstLine="0"/>
+              <w:jc w:val="left"/>
+            </w:pPr>
+            <w:r/>
+            <w:r>
+              <w:rPr>
+                <w:rFonts w:ascii="Times New Roman" w:hAnsi="Times New Roman" w:eastAsia="Times New Roman"/>
+                <w:b/>
+                <w:i w:val="0"/>
+                <w:sz w:val="24"/>
+              </w:rPr>
+              <w:t>Overall Rating (/5.00)</w:t>
+            </w:r>
+          </w:p>
+        </w:tc>
+        <w:tc>
+          <w:tcPr>
+            <w:tcW w:type="dxa" w:w="2256"/>
+          </w:tcPr>
+          <w:p>
+            <w:pPr>
+              <w:spacing w:line="240" w:lineRule="auto" w:before="0" w:after="0"/>
+              <w:ind w:firstLine="0"/>
+              <w:jc w:val="left"/>
+            </w:pPr>
+            <w:r/>
+            <w:r>
+              <w:rPr>
+                <w:rFonts w:ascii="Times New Roman" w:hAnsi="Times New Roman" w:eastAsia="Times New Roman"/>
+                <w:b/>
+                <w:i w:val="0"/>
+                <w:sz w:val="24"/>
+              </w:rPr>
+              <w:t>Interpretation Band</w:t>
+            </w:r>
+          </w:p>
+        </w:tc>
+      </w:tr>
+      <w:tr>
+        <w:tc>
+          <w:tcPr>
+            <w:tcW w:type="dxa" w:w="2256"/>
+          </w:tcPr>
+          <w:p>
+            <w:pPr>
+              <w:spacing w:line="240" w:lineRule="auto" w:before="0" w:after="0"/>
+              <w:ind w:firstLine="0"/>
+              <w:jc w:val="left"/>
+            </w:pPr>
+            <w:r/>
+            <w:r>
+              <w:rPr>
+                <w:rFonts w:ascii="Times New Roman" w:hAnsi="Times New Roman" w:eastAsia="Times New Roman"/>
+                <w:b w:val="0"/>
+                <w:i w:val="0"/>
+                <w:sz w:val="24"/>
+              </w:rPr>
+              <w:t>1st</w:t>
+            </w:r>
+          </w:p>
+        </w:tc>
+        <w:tc>
+          <w:tcPr>
+            <w:tcW w:type="dxa" w:w="2256"/>
+          </w:tcPr>
+          <w:p>
+            <w:pPr>
+              <w:spacing w:line="240" w:lineRule="auto" w:before="0" w:after="0"/>
+              <w:ind w:firstLine="0"/>
+              <w:jc w:val="left"/>
+            </w:pPr>
+            <w:r/>
+            <w:r>
+              <w:rPr>
+                <w:rFonts w:ascii="Times New Roman" w:hAnsi="Times New Roman" w:eastAsia="Times New Roman"/>
+                <w:b w:val="0"/>
+                <w:i w:val="0"/>
+                <w:sz w:val="24"/>
+              </w:rPr>
+              <w:t>Lecturer A</w:t>
+            </w:r>
+          </w:p>
+        </w:tc>
+        <w:tc>
+          <w:tcPr>
+            <w:tcW w:type="dxa" w:w="2256"/>
+          </w:tcPr>
+          <w:p>
+            <w:pPr>
+              <w:spacing w:line="240" w:lineRule="auto" w:before="0" w:after="0"/>
+              <w:ind w:firstLine="0"/>
+              <w:jc w:val="left"/>
+            </w:pPr>
+            <w:r/>
+            <w:r>
+              <w:rPr>
+                <w:rFonts w:ascii="Times New Roman" w:hAnsi="Times New Roman" w:eastAsia="Times New Roman"/>
+                <w:b w:val="0"/>
+                <w:i w:val="0"/>
+                <w:sz w:val="24"/>
+              </w:rPr>
+              <w:t>4.17</w:t>
+            </w:r>
+          </w:p>
+        </w:tc>
+        <w:tc>
+          <w:tcPr>
+            <w:tcW w:type="dxa" w:w="2256"/>
+          </w:tcPr>
+          <w:p>
+            <w:pPr>
+              <w:spacing w:line="240" w:lineRule="auto" w:before="0" w:after="0"/>
+              <w:ind w:firstLine="0"/>
+              <w:jc w:val="left"/>
+            </w:pPr>
+            <w:r/>
+            <w:r>
+              <w:rPr>
+                <w:rFonts w:ascii="Times New Roman" w:hAnsi="Times New Roman" w:eastAsia="Times New Roman"/>
+                <w:b w:val="0"/>
+                <w:i w:val="0"/>
+                <w:sz w:val="24"/>
+              </w:rPr>
+              <w:t>High</w:t>
+            </w:r>
+          </w:p>
+        </w:tc>
+      </w:tr>
+      <w:tr>
+        <w:tc>
+          <w:tcPr>
+            <w:tcW w:type="dxa" w:w="2256"/>
+          </w:tcPr>
+          <w:p>
+            <w:pPr>
+              <w:spacing w:line="240" w:lineRule="auto" w:before="0" w:after="0"/>
+              <w:ind w:firstLine="0"/>
+              <w:jc w:val="left"/>
+            </w:pPr>
+            <w:r/>
+            <w:r>
+              <w:rPr>
+                <w:rFonts w:ascii="Times New Roman" w:hAnsi="Times New Roman" w:eastAsia="Times New Roman"/>
+                <w:b w:val="0"/>
+                <w:i w:val="0"/>
+                <w:sz w:val="24"/>
+              </w:rPr>
+              <w:t>2nd</w:t>
+            </w:r>
+          </w:p>
+        </w:tc>
+        <w:tc>
+          <w:tcPr>
+            <w:tcW w:type="dxa" w:w="2256"/>
+          </w:tcPr>
+          <w:p>
+            <w:pPr>
+              <w:spacing w:line="240" w:lineRule="auto" w:before="0" w:after="0"/>
+              <w:ind w:firstLine="0"/>
+              <w:jc w:val="left"/>
+            </w:pPr>
+            <w:r/>
+            <w:r>
+              <w:rPr>
+                <w:rFonts w:ascii="Times New Roman" w:hAnsi="Times New Roman" w:eastAsia="Times New Roman"/>
+                <w:b w:val="0"/>
+                <w:i w:val="0"/>
+                <w:sz w:val="24"/>
+              </w:rPr>
+              <w:t>Lecturer C</w:t>
+            </w:r>
+          </w:p>
+        </w:tc>
+        <w:tc>
+          <w:tcPr>
+            <w:tcW w:type="dxa" w:w="2256"/>
+          </w:tcPr>
+          <w:p>
+            <w:pPr>
+              <w:spacing w:line="240" w:lineRule="auto" w:before="0" w:after="0"/>
+              <w:ind w:firstLine="0"/>
+              <w:jc w:val="left"/>
+            </w:pPr>
+            <w:r/>
+            <w:r>
+              <w:rPr>
+                <w:rFonts w:ascii="Times New Roman" w:hAnsi="Times New Roman" w:eastAsia="Times New Roman"/>
+                <w:b w:val="0"/>
+                <w:i w:val="0"/>
+                <w:sz w:val="24"/>
+              </w:rPr>
+              <w:t>4.04</w:t>
+            </w:r>
+          </w:p>
+        </w:tc>
+        <w:tc>
+          <w:tcPr>
+            <w:tcW w:type="dxa" w:w="2256"/>
+          </w:tcPr>
+          <w:p>
+            <w:pPr>
+              <w:spacing w:line="240" w:lineRule="auto" w:before="0" w:after="0"/>
+              <w:ind w:firstLine="0"/>
+              <w:jc w:val="left"/>
+            </w:pPr>
+            <w:r/>
+            <w:r>
+              <w:rPr>
+                <w:rFonts w:ascii="Times New Roman" w:hAnsi="Times New Roman" w:eastAsia="Times New Roman"/>
+                <w:b w:val="0"/>
+                <w:i w:val="0"/>
+                <w:sz w:val="24"/>
+              </w:rPr>
+              <w:t>High</w:t>
+            </w:r>
+          </w:p>
+        </w:tc>
+      </w:tr>
+      <w:tr>
+        <w:tc>
+          <w:tcPr>
+            <w:tcW w:type="dxa" w:w="2256"/>
+          </w:tcPr>
+          <w:p>
+            <w:pPr>
+              <w:spacing w:line="240" w:lineRule="auto" w:before="0" w:after="0"/>
+              <w:ind w:firstLine="0"/>
+              <w:jc w:val="left"/>
+            </w:pPr>
+            <w:r/>
+            <w:r>
+              <w:rPr>
+                <w:rFonts w:ascii="Times New Roman" w:hAnsi="Times New Roman" w:eastAsia="Times New Roman"/>
+                <w:b w:val="0"/>
+                <w:i w:val="0"/>
+                <w:sz w:val="24"/>
+              </w:rPr>
+              <w:t>3rd</w:t>
+            </w:r>
+          </w:p>
+        </w:tc>
+        <w:tc>
+          <w:tcPr>
+            <w:tcW w:type="dxa" w:w="2256"/>
+          </w:tcPr>
+          <w:p>
+            <w:pPr>
+              <w:spacing w:line="240" w:lineRule="auto" w:before="0" w:after="0"/>
+              <w:ind w:firstLine="0"/>
+              <w:jc w:val="left"/>
+            </w:pPr>
+            <w:r/>
+            <w:r>
+              <w:rPr>
+                <w:rFonts w:ascii="Times New Roman" w:hAnsi="Times New Roman" w:eastAsia="Times New Roman"/>
+                <w:b w:val="0"/>
+                <w:i w:val="0"/>
+                <w:sz w:val="24"/>
+              </w:rPr>
+              <w:t>Lecturer B</w:t>
+            </w:r>
+          </w:p>
+        </w:tc>
+        <w:tc>
+          <w:tcPr>
+            <w:tcW w:type="dxa" w:w="2256"/>
+          </w:tcPr>
+          <w:p>
+            <w:pPr>
+              <w:spacing w:line="240" w:lineRule="auto" w:before="0" w:after="0"/>
+              <w:ind w:firstLine="0"/>
+              <w:jc w:val="left"/>
+            </w:pPr>
+            <w:r/>
+            <w:r>
+              <w:rPr>
+                <w:rFonts w:ascii="Times New Roman" w:hAnsi="Times New Roman" w:eastAsia="Times New Roman"/>
+                <w:b w:val="0"/>
+                <w:i w:val="0"/>
+                <w:sz w:val="24"/>
+              </w:rPr>
+              <w:t>3.83</w:t>
+            </w:r>
+          </w:p>
+        </w:tc>
+        <w:tc>
+          <w:tcPr>
+            <w:tcW w:type="dxa" w:w="2256"/>
+          </w:tcPr>
+          <w:p>
+            <w:pPr>
+              <w:spacing w:line="240" w:lineRule="auto" w:before="0" w:after="0"/>
+              <w:ind w:firstLine="0"/>
+              <w:jc w:val="left"/>
+            </w:pPr>
+            <w:r/>
+            <w:r>
+              <w:rPr>
+                <w:rFonts w:ascii="Times New Roman" w:hAnsi="Times New Roman" w:eastAsia="Times New Roman"/>
+                <w:b w:val="0"/>
+                <w:i w:val="0"/>
+                <w:sz w:val="24"/>
+              </w:rPr>
+              <w:t>High</w:t>
+            </w:r>
+          </w:p>
+        </w:tc>
+      </w:tr>
+    </w:tbl>
+    <w:p>
+      <w:pPr>
+        <w:spacing w:line="360" w:lineRule="auto" w:before="0" w:after="0"/>
+        <w:ind w:firstLine="0"/>
+        <w:jc w:val="center"/>
+      </w:pPr>
+      <w:r>
+        <w:rPr>
+          <w:rFonts w:ascii="Times New Roman" w:hAnsi="Times New Roman" w:eastAsia="Times New Roman"/>
+          <w:b w:val="0"/>
+          <w:i w:val="0"/>
+          <w:sz w:val="28"/>
+        </w:rPr>
+      </w:r>
+    </w:p>
+    <w:p>
+      <w:pPr>
+        <w:spacing w:line="360" w:lineRule="auto" w:before="0" w:after="0"/>
+        <w:ind w:firstLine="720"/>
+        <w:jc w:val="both"/>
+      </w:pPr>
+      <w:r>
+        <w:rPr>
+          <w:rFonts w:ascii="Times New Roman" w:hAnsi="Times New Roman" w:eastAsia="Times New Roman"/>
+          <w:b w:val="0"/>
+          <w:i w:val="0"/>
+          <w:sz w:val="28"/>
+        </w:rPr>
+        <w:t>Table 4.7 ranks lecturers by the Total Overview described in Section 3.7.1. All three fall in the High band (3.50-5.00), which means no lecturer in the sample is weak overall; rather, they differ in which dimensions drive their strength (Lecturer A on notes, interactiveness, and communication; Lecturer C on approachability and notes; Lecturer B on control, punctuality, and audibility). This confirms the multidimensional finding in Hypothesis Two: lecturers genuinely differ on rated qualities, so a profile view is more informative than a single rank.</w:t>
+      </w:r>
+    </w:p>
+    <w:p>
+      <w:pPr>
         <w:spacing w:line="360" w:lineRule="auto" w:before="80" w:after="40"/>
         <w:ind w:firstLine="0"/>
         <w:jc w:val="both"/>
@@ -11732,7 +13056,7 @@
           <w:i w:val="0"/>
           <w:sz w:val="28"/>
         </w:rPr>
-        <w:t>Security features included hashed passwords (password_hash), prepared statements against SQL injection, session-based role gates, and CSRF protection on state-changing forms. Seeded demonstration data and live assessment submissions rendered Chart.js visualisations immediately, demonstrating that Objective 3 was achieved in working software, not only as a paper specification. Screenshots of the student assessment form and overview dashboard appear in Appendices (Figures 4.3 and 4.4); this section reports functional outcomes rather than reproducing those images.</w:t>
+        <w:t>Security features included hashed passwords (password_hash), session regeneration on login with secure/HttpOnly/SameSite cookies, prepared statements against SQL injection, CSRF protection on state-changing forms, rate limiting on login/register/forgot-password (5 attempts, 15-minute lockout), single-use time-limited password-reset tokens, generic error messages preventing email enumeration, and role-based access gates. Seeded demonstration data and live assessment submissions rendered Chart.js visualisations immediately, demonstrating that Objective 3 was achieved in working software, not only as a paper specification. Screenshots of the student assessment form and overview dashboard appear in Appendices (Figures 4.3 and 4.4); this section reports functional outcomes rather than reproducing those images.</w:t>
       </w:r>
     </w:p>
     <w:p>
@@ -11757,7 +13081,7 @@
           <w:i w:val="0"/>
           <w:sz w:val="28"/>
         </w:rPr>
-        <w:t xml:space="preserve"> Test cases confirmed successful authentication by role; rejection of unauthenticated access to protected pages; blocked duplicate assessments where configured; correct computation of quality means for chart endpoints; and readable layout on narrow mobile viewports. Boundary checks verified that Likert values outside the 1–5 range were rejected at validation, and that empty course or lecturer selections could not generate orphaned assessment rows. Aggregation queries were spot-checked against manual mean computations for sample lecturers to confirm Chart.js inputs matched database outputs. Usability feedback summarised in Table 4.5 supports user acceptance. Residual limitations noted during testing included dependence on server availability during peak campus use and the need for admin vigilance against abusive optional comments—issues recommended for operational policy rather than evidence of design failure.</w:t>
+        <w:t xml:space="preserve"> Test cases confirmed successful authentication by role; rejection of unauthenticated access to protected pages; blocked duplicate assessments where configured; end-to-end password recovery (request link, token validation, password update, single-use invalidation); rate-limit lockout after repeated failures; correct computation of quality means for chart endpoints; and readable layout on narrow mobile viewports. Boundary checks verified that Likert values outside the 1–5 range were rejected at validation, that empty course or lecturer selections could not generate orphaned assessment rows, and that expired or reused reset tokens were rejected. Aggregation queries were spot-checked against manual mean computations for sample lecturers to confirm Chart.js inputs matched database outputs. Usability feedback summarised in Table 4.5 supports user acceptance. Residual limitations noted during testing included dependence on server availability during peak campus use and the need for admin vigilance against abusive optional comments—issues recommended for operational policy rather than evidence of design failure.</w:t>
       </w:r>
     </w:p>
     <w:p>
@@ -12020,7 +13344,25 @@
           <w:i w:val="0"/>
           <w:sz w:val="28"/>
         </w:rPr>
-        <w:t>1. Three Computer Science lecturers were interviewed separately through oral sessions with note-taking. After compilation of those notes, eight assessment qualities were retained for student evaluation: interactiveness, audibility, availability of lecture notes, class control, communication, punctuality, fairness in assessment, and approachability. Presence across note sets ranged from 66.7% to 100% (n = 3). Interviewees rejected one-number reputation labels in favour of dimensional feedback, and paraphrases confirmed that inherited fresher fear and early-semester reputational repair are recognised teaching burdens.</w:t>
+        <w:t xml:space="preserve">1. Ten Computer Science lecturers completed a questionnaire listing fifteen assessment qualities. The eight qualities most frequently selected across the ten questionnaires were retained for student evaluation: interactiveness, audibility, availability of lecture notes, class control, communication, punctuality, fairness in assessment, and approachability. Selection frequency across the ten lecturers determined which eight qualities were retained. Lecturers rejected one-number reputation labels in favour of dimensional feedback, and questionnaire responses confirmed that inherited fresher fear and early-semester reputational repair are recognised teaching burdens. This finding delivers </w:t>
+      </w:r>
+      <w:r>
+        <w:rPr>
+          <w:rFonts w:ascii="Times New Roman" w:hAnsi="Times New Roman" w:eastAsia="Times New Roman"/>
+          <w:b/>
+          <w:i w:val="0"/>
+          <w:sz w:val="28"/>
+        </w:rPr>
+        <w:t>Objective 1</w:t>
+      </w:r>
+      <w:r>
+        <w:rPr>
+          <w:rFonts w:ascii="Times New Roman" w:hAnsi="Times New Roman" w:eastAsia="Times New Roman"/>
+          <w:b w:val="0"/>
+          <w:i w:val="0"/>
+          <w:sz w:val="28"/>
+        </w:rPr>
+        <w:t>.</w:t>
       </w:r>
     </w:p>
     <w:p>
@@ -12036,7 +13378,25 @@
           <w:i w:val="0"/>
           <w:sz w:val="28"/>
         </w:rPr>
-        <w:t>2. Students judged the automated anonymous response form clear (87.5%), quick (83.8%), and honesty-supporting under anonymity (90.0%), with 85.0% affirming that the eight qualities covered what matters in class. Design features—controlled lecturer/course selection, Likert items, optional comments, and duplicate-submission control—proved workable in the departmental setting and addressed documented Nigerian concerns about victimisation in SET contexts.</w:t>
+        <w:t xml:space="preserve">2. Students judged the automated anonymous response form clear (87.5%), quick (83.8%), and honesty-supporting under anonymity (90.0%), with 85.0% affirming that the eight qualities covered what matters in class. Design features—controlled lecturer/course selection, Likert items, optional comments, and duplicate-submission control—proved workable in the departmental setting and addressed documented Nigerian concerns about victimisation in SET contexts. This finding delivers </w:t>
+      </w:r>
+      <w:r>
+        <w:rPr>
+          <w:rFonts w:ascii="Times New Roman" w:hAnsi="Times New Roman" w:eastAsia="Times New Roman"/>
+          <w:b/>
+          <w:i w:val="0"/>
+          <w:sz w:val="28"/>
+        </w:rPr>
+        <w:t>Objective 2</w:t>
+      </w:r>
+      <w:r>
+        <w:rPr>
+          <w:rFonts w:ascii="Times New Roman" w:hAnsi="Times New Roman" w:eastAsia="Times New Roman"/>
+          <w:b w:val="0"/>
+          <w:i w:val="0"/>
+          <w:sz w:val="28"/>
+        </w:rPr>
+        <w:t>.</w:t>
       </w:r>
     </w:p>
     <w:p>
@@ -12068,7 +13428,7 @@
           <w:i w:val="0"/>
           <w:sz w:val="28"/>
         </w:rPr>
-        <w:t>4. Sample aggregated profiles for Lecturers A, B, and C showed that no lecturer dominated every dimension. Overview therefore supported adaptive strategy—matching preparation to a lecturer’s pattern—rather than stereotyping. Contrasting profiles illustrated how control-and-punctuality strengths can coexist with lower interactiveness, and how notes-and-communication strengths can coexist with moderate audibility.</w:t>
+        <w:t>4. Sample aggregated profiles for Lecturers A, B, and C showed that no lecturer dominated every dimension. Overview therefore supported adaptive strategy - matching preparation to a lecturer's pattern - rather than stereotyping. Applying the Total Overview computation (simple average of the eight quality means, Section 3.7.1), Lecturer A ranked 1st (4.17), Lecturer C 2nd (4.04), and Lecturer B 3rd (3.83); all three fell in the High band. Contrasting profiles illustrated how control-and-punctuality strengths can coexist with lower interactiveness, and how notes-and-communication strengths can coexist with moderate audibility.</w:t>
       </w:r>
     </w:p>
     <w:p>
@@ -12230,7 +13590,7 @@
           <w:i w:val="0"/>
           <w:sz w:val="28"/>
         </w:rPr>
-        <w:t>1. The Department of Computer Science should adopt the portal, or an equivalent eight-quality overview system, each semester for student orientation and formative lecturer feedback, with a short briefing so that freshers understand charts as preparation aids rather than as gossip replacements with official stamps. 2. Students should consult multidimensional overviews early in the semester and then verify patterns through personal classroom experience, treating charts as preparation aids rather than as final verdicts. 3. Lecturers should use dashboards as improvement intelligence—protecting strengths and addressing weaker dimensions—while maintaining consistency that allows reputation to stabilise across intakes. 4. Departmental and university management should support anonymous aggregated teaching feedback without making it the sole criterion for promotion or disciplinary action. 5. System administrators should protect privacy, moderate abusive optional comments, keep course and lecturer records current, and schedule assessment windows that reduce both fear and ballot-stuffing incentives. 6. Student associations and orientation leaders should gradually shift fresher culture from fear stories toward evidence-based adjustment tips linked to the portal’s quality dimensions—for example, advising peers to check notes and punctuality means before repeating unverified “fail everyone” claims.</w:t>
+        <w:t>1. The Department of Computer Science should adopt the portal, or an equivalent eight-quality overview system, each semester for student orientation and formative lecturer feedback, with a short briefing so that freshers understand charts as preparation aids rather than as gossip replacements with official stamps. 2. Students should consult multidimensional overviews early in the semester and then verify patterns through personal classroom experience, treating charts as preparation aids rather than as final verdicts. 3. Lecturers should use dashboards as improvement intelligence—protecting strengths and addressing weaker dimensions—while maintaining consistency that allows reputation to stabilise across intakes. 4. Departmental and university management should support anonymous aggregated teaching feedback without making it the sole criterion for promotion or disciplinary action. 5. System administrators should protect privacy, moderate abusive optional comments, keep course and lecturer records current, schedule assessment windows that reduce both fear and ballot-stuffing incentives, and operate the password-recovery and rate-limiting controls (5 attempts / 15-minute lockout) so that account recovery remains available without weakening authentication. 6. Student associations and orientation leaders should gradually shift fresher culture from fear stories toward evidence-based adjustment tips linked to the portal’s quality dimensions—for example, advising peers to check notes and punctuality means before repeating unverified “fail everyone” claims.</w:t>
       </w:r>
     </w:p>
     <w:p>
@@ -12278,7 +13638,7 @@
           <w:i w:val="0"/>
           <w:sz w:val="28"/>
         </w:rPr>
-        <w:t xml:space="preserve">1. It provides an eight-quality lecturer assessment framework grounded in separate oral interviews (with note-taking and later compilation) with Computer Science lecturers at the University of Nigeria, Nsukka, translating local classroom concerns into measurable indicators aligned with multidimensional SET scholarship. 2. It documents a complete pipeline from quality validation, through an automated response form, to a PHP chart-based overview designed expressly for </w:t>
+        <w:t xml:space="preserve">1. It provides an eight-quality lecturer assessment framework grounded in a fifteen-quality questionnaire administered to ten Computer Science lecturers at the University of Nigeria, Nsukka, from which the eight most selected qualities were retained, translating local classroom concerns into measurable indicators aligned with multidimensional SET scholarship. 2. It documents a complete pipeline from quality validation, through an automated response form, to a PHP chart-based overview designed expressly for </w:t>
       </w:r>
       <w:r>
         <w:rPr>

</xml_diff>